<commit_message>
Refactor SLIK form: simplify layout with jenis_kredit field and alasan/keterangan column
</commit_message>
<xml_diff>
--- a/frontend/templates/template_purna.docx
+++ b/frontend/templates/template_purna.docx
@@ -16,8 +16,8 @@
           <w:u w:val="single"/>
         </w:rPr>
       </w:pPr>
-      <w:bookmarkStart w:id="0" w:name="OLE_LINK30"/>
-      <w:bookmarkStart w:id="1" w:name="OLE_LINK2"/>
+      <w:bookmarkStart w:id="0" w:name="OLE_LINK2"/>
+      <w:bookmarkStart w:id="1" w:name="OLE_LINK30"/>
       <w:r>
         <w:rPr>
           <w:rFonts w:ascii="Kalinga" w:hAnsi="Kalinga" w:cs="Kalinga"/>
@@ -923,7 +923,30 @@
           <w:sz w:val="20"/>
           <w:szCs w:val="20"/>
         </w:rPr>
-        <w:t>-{{fasilitas_nihil}}{{/slik_nihil}}{{#slik_ada_fasilitas}}</w:t>
+        <w:t>-{{fasilitas_nihil</w:t>
+      </w:r>
+      <w:r>
+        <w:rPr>
+          <w:rFonts w:hint="default" w:ascii="Kalinga" w:hAnsi="Kalinga"/>
+          <w:b w:val="0"/>
+          <w:bCs w:val="0"/>
+          <w:color w:val="auto"/>
+          <w:sz w:val="20"/>
+          <w:szCs w:val="20"/>
+          <w:lang w:val="en-US"/>
+        </w:rPr>
+        <w:t>_text</w:t>
+      </w:r>
+      <w:r>
+        <w:rPr>
+          <w:rFonts w:hint="default" w:ascii="Kalinga" w:hAnsi="Kalinga"/>
+          <w:b w:val="0"/>
+          <w:bCs w:val="0"/>
+          <w:color w:val="auto"/>
+          <w:sz w:val="20"/>
+          <w:szCs w:val="20"/>
+        </w:rPr>
+        <w:t>}}{{/slik_nihil}}{{#slik_ada_fasilitas}}</w:t>
       </w:r>
     </w:p>
     <w:p>
@@ -1323,8 +1346,8 @@
         <w:jc w:val="both"/>
         <w:rPr>
           <w:rFonts w:ascii="Kalinga" w:hAnsi="Kalinga" w:cs="Kalinga"/>
-          <w:b/>
-          <w:bCs/>
+          <w:b w:val="0"/>
+          <w:bCs w:val="0"/>
           <w:color w:val="auto"/>
           <w:sz w:val="20"/>
           <w:szCs w:val="20"/>
@@ -1349,7 +1372,7 @@
           <w:bCs/>
           <w:i/>
           <w:iCs/>
-          <w:color w:val="FF0000"/>
+          <w:color w:val="0000FF"/>
           <w:sz w:val="20"/>
           <w:szCs w:val="20"/>
           <w:u w:val="single"/>
@@ -2775,34 +2798,8 @@
           <w:color w:val="auto"/>
           <w:sz w:val="20"/>
           <w:szCs w:val="20"/>
-          <w:u w:val="single"/>
-        </w:rPr>
-        <w:t>Angsuran Eksisting Pemohon Cfm SLIK tanggal {{tgl_slik}} dengan data sebagai berikut</w:t>
-      </w:r>
-      <w:r>
-        <w:rPr>
-          <w:rFonts w:hint="default" w:ascii="Kalinga" w:hAnsi="Kalinga"/>
-          <w:b/>
-          <w:bCs/>
-          <w:color w:val="auto"/>
-          <w:sz w:val="20"/>
-          <w:szCs w:val="20"/>
-          <w:u w:val="single"/>
-          <w:lang w:val="en-US"/>
-        </w:rPr>
-        <w:t xml:space="preserve"> </w:t>
-      </w:r>
-      <w:r>
-        <w:rPr>
-          <w:rFonts w:hint="default" w:ascii="Kalinga" w:hAnsi="Kalinga"/>
-          <w:b/>
-          <w:bCs/>
-          <w:color w:val="auto"/>
-          <w:sz w:val="20"/>
-          <w:szCs w:val="20"/>
-          <w:u w:val="single"/>
-        </w:rPr>
-        <w:t>:</w:t>
+        </w:rPr>
+        <w:t>Cfm. Info SLIK Ideb posisi terakhir Tanggal {{tgl_slik}} Pemohon memiliki Fasilitas Kredit sebagai berikut :</w:t>
       </w:r>
       <w:r>
         <w:rPr>
@@ -2839,7 +2836,30 @@
           <w:sz w:val="20"/>
           <w:szCs w:val="20"/>
         </w:rPr>
-        <w:t>-{{fasilitas_nihil}}{{/slik_nihil}}{{#slik_ada_fasilitas}}</w:t>
+        <w:t>-{{fasilitas_nihil</w:t>
+      </w:r>
+      <w:r>
+        <w:rPr>
+          <w:rFonts w:hint="default" w:ascii="Kalinga" w:hAnsi="Kalinga"/>
+          <w:b w:val="0"/>
+          <w:bCs w:val="0"/>
+          <w:color w:val="auto"/>
+          <w:sz w:val="20"/>
+          <w:szCs w:val="20"/>
+          <w:lang w:val="en-US"/>
+        </w:rPr>
+        <w:t>_text</w:t>
+      </w:r>
+      <w:r>
+        <w:rPr>
+          <w:rFonts w:hint="default" w:ascii="Kalinga" w:hAnsi="Kalinga"/>
+          <w:b w:val="0"/>
+          <w:bCs w:val="0"/>
+          <w:color w:val="auto"/>
+          <w:sz w:val="20"/>
+          <w:szCs w:val="20"/>
+        </w:rPr>
+        <w:t>}}{{/slik_nihil}}{{#slik_ada_fasilitas}}</w:t>
       </w:r>
     </w:p>
     <w:p>
@@ -3265,7 +3285,7 @@
           <w:bCs/>
           <w:i/>
           <w:iCs/>
-          <w:color w:val="FF0000"/>
+          <w:color w:val="0000FF"/>
           <w:sz w:val="20"/>
           <w:szCs w:val="20"/>
           <w:u w:val="single"/>
@@ -3298,8 +3318,6 @@
           <w:szCs w:val="20"/>
         </w:rPr>
       </w:pPr>
-      <w:bookmarkStart w:id="17" w:name="_GoBack"/>
-      <w:bookmarkEnd w:id="17"/>
     </w:p>
     <w:p>
       <w:pPr>
@@ -3882,13 +3900,13 @@
       <w:bookmarkStart w:id="4" w:name="OLE_LINK8"/>
       <w:bookmarkStart w:id="5" w:name="OLE_LINK17"/>
       <w:bookmarkStart w:id="6" w:name="OLE_LINK10"/>
-      <w:bookmarkStart w:id="7" w:name="OLE_LINK27"/>
-      <w:bookmarkStart w:id="8" w:name="OLE_LINK24"/>
-      <w:bookmarkStart w:id="9" w:name="OLE_LINK41"/>
-      <w:bookmarkStart w:id="10" w:name="OLE_LINK23"/>
-      <w:bookmarkStart w:id="11" w:name="OLE_LINK3"/>
-      <w:bookmarkStart w:id="12" w:name="OLE_LINK33"/>
-      <w:bookmarkStart w:id="13" w:name="OLE_LINK32"/>
+      <w:bookmarkStart w:id="7" w:name="OLE_LINK32"/>
+      <w:bookmarkStart w:id="8" w:name="OLE_LINK41"/>
+      <w:bookmarkStart w:id="9" w:name="OLE_LINK27"/>
+      <w:bookmarkStart w:id="10" w:name="OLE_LINK24"/>
+      <w:bookmarkStart w:id="11" w:name="OLE_LINK33"/>
+      <w:bookmarkStart w:id="12" w:name="OLE_LINK3"/>
+      <w:bookmarkStart w:id="13" w:name="OLE_LINK23"/>
       <w:r>
         <w:rPr>
           <w:rFonts w:ascii="Kalinga" w:hAnsi="Kalinga" w:cs="Kalinga"/>
@@ -3898,7 +3916,7 @@
           <w:sz w:val="20"/>
           <w:szCs w:val="20"/>
         </w:rPr>
-        <w:t>Repayment Capacity dapat mengcover angsuran yang akan diberikan, DSR sebesar :</w:t>
+        <w:t>Repayment Capacity dapat mengcover angsuran yang akan diberikan, DSR sebesar</w:t>
       </w:r>
       <w:r>
         <w:rPr>
@@ -3921,17 +3939,6 @@
           <w:sz w:val="20"/>
           <w:szCs w:val="20"/>
         </w:rPr>
-        <w:tab/>
-      </w:r>
-      <w:r>
-        <w:rPr>
-          <w:rFonts w:hint="default" w:ascii="Kalinga" w:hAnsi="Kalinga"/>
-          <w:b/>
-          <w:bCs/>
-          <w:color w:val="auto"/>
-          <w:sz w:val="20"/>
-          <w:szCs w:val="20"/>
-        </w:rPr>
         <w:t>{{rpc_dsr}}</w:t>
       </w:r>
       <w:r>
@@ -3943,7 +3950,32 @@
           <w:sz w:val="20"/>
           <w:szCs w:val="20"/>
         </w:rPr>
-        <w:t xml:space="preserve">% Penghasilan per bulan &gt; atau sama dengan Rp. 20 juta, Maksimal DSR = 90% (Cfm. Memo PDM/9.3/5176 Tanggal 01-10-2019). Hasil </w:t>
+        <w:t>%</w:t>
+      </w:r>
+      <w:r>
+        <w:rPr>
+          <w:rFonts w:hint="default" w:ascii="Kalinga" w:hAnsi="Kalinga" w:cs="Kalinga"/>
+          <w:b/>
+          <w:bCs/>
+          <w:color w:val="auto"/>
+          <w:sz w:val="20"/>
+          <w:szCs w:val="20"/>
+          <w:lang w:val="en-US"/>
+        </w:rPr>
+        <w:t xml:space="preserve"> </w:t>
+      </w:r>
+      <w:bookmarkStart w:id="17" w:name="_GoBack"/>
+      <w:bookmarkEnd w:id="17"/>
+      <w:r>
+        <w:rPr>
+          <w:rFonts w:ascii="Kalinga" w:hAnsi="Kalinga" w:cs="Kalinga"/>
+          <w:b/>
+          <w:bCs/>
+          <w:color w:val="auto"/>
+          <w:sz w:val="20"/>
+          <w:szCs w:val="20"/>
+        </w:rPr>
+        <w:t xml:space="preserve">Penghasilan per bulan &gt; atau sama dengan Rp. 20 juta, Maksimal DSR = 90% (Cfm. Memo PDM/9.3/5176 Tanggal 01-10-2019). Hasil </w:t>
       </w:r>
       <w:r>
         <w:rPr>

</xml_diff>

<commit_message>
Update SLIK and Proposal forms: add Top Up Sisa Gaji fields and additional fees
</commit_message>
<xml_diff>
--- a/frontend/templates/template_purna.docx
+++ b/frontend/templates/template_purna.docx
@@ -810,7 +810,7 @@
           <w:szCs w:val="20"/>
           <w:lang w:val="en-US"/>
         </w:rPr>
-        <w:t xml:space="preserve"> </w:t>
+        <w:t xml:space="preserve"> {{jenis_pengajuan}} </w:t>
       </w:r>
       <w:r>
         <w:rPr>
@@ -3964,8 +3964,6 @@
         </w:rPr>
         <w:t xml:space="preserve"> </w:t>
       </w:r>
-      <w:bookmarkStart w:id="17" w:name="_GoBack"/>
-      <w:bookmarkEnd w:id="17"/>
       <w:r>
         <w:rPr>
           <w:rFonts w:ascii="Kalinga" w:hAnsi="Kalinga" w:cs="Kalinga"/>
@@ -4010,7 +4008,42 @@
           <w:sz w:val="20"/>
           <w:szCs w:val="20"/>
         </w:rPr>
-        <w:t xml:space="preserve">Program </w:t>
+        <w:t>Program</w:t>
+      </w:r>
+      <w:r>
+        <w:rPr>
+          <w:rFonts w:hint="default" w:ascii="Kalinga" w:hAnsi="Kalinga" w:eastAsia="SimSun" w:cs="Kalinga"/>
+          <w:b/>
+          <w:bCs/>
+          <w:color w:val="auto"/>
+          <w:sz w:val="20"/>
+          <w:szCs w:val="20"/>
+          <w:lang w:val="en-US"/>
+        </w:rPr>
+        <w:t xml:space="preserve"> </w:t>
+      </w:r>
+      <w:r>
+        <w:rPr>
+          <w:rFonts w:hint="default" w:ascii="Kalinga" w:hAnsi="Kalinga" w:eastAsia="SimSun"/>
+          <w:b/>
+          <w:bCs/>
+          <w:color w:val="auto"/>
+          <w:sz w:val="20"/>
+          <w:szCs w:val="20"/>
+          <w:lang w:val="en-US"/>
+        </w:rPr>
+        <w:t>{{kode_program}}</w:t>
+      </w:r>
+      <w:r>
+        <w:rPr>
+          <w:rFonts w:ascii="Kalinga" w:hAnsi="Kalinga" w:eastAsia="SimSun" w:cs="Kalinga"/>
+          <w:b/>
+          <w:bCs/>
+          <w:color w:val="auto"/>
+          <w:sz w:val="20"/>
+          <w:szCs w:val="20"/>
+        </w:rPr>
+        <w:t xml:space="preserve"> </w:t>
       </w:r>
       <w:r>
         <w:rPr>
@@ -4421,16 +4454,16 @@
           <w:szCs w:val="20"/>
           <w:lang w:val="en-US"/>
         </w:rPr>
-        <w:t>.</w:t>
-      </w:r>
-      <w:r>
-        <w:rPr>
-          <w:rFonts w:hint="default" w:ascii="Kalinga" w:hAnsi="Kalinga"/>
-          <w:color w:val="auto"/>
-          <w:sz w:val="20"/>
-          <w:szCs w:val="20"/>
-        </w:rPr>
-        <w:t xml:space="preserve"> (Cfm Surat No DNS/5.4/8023 Perihal Program Pricing BNI Fleksi (Aktif&amp;Pensiun) Semester II 2025 tanggal 01-09-2025.</w:t>
+        <w:t xml:space="preserve">. </w:t>
+      </w:r>
+      <w:r>
+        <w:rPr>
+          <w:rFonts w:hint="default" w:ascii="Kalinga" w:hAnsi="Kalinga"/>
+          <w:color w:val="auto"/>
+          <w:sz w:val="20"/>
+          <w:szCs w:val="20"/>
+        </w:rPr>
+        <w:t>{{catatan_program_pricing}}</w:t>
       </w:r>
     </w:p>
     <w:p>
@@ -4594,7 +4627,7 @@
           <w:sz w:val="20"/>
           <w:szCs w:val="20"/>
         </w:rPr>
-        <w:t>Kesanggupan Pembayaran Angsuran Kredit Perbulan Diatas 70% dari Uang Pensiun atau Manfaat Pensiun Bulanan Yang Diterima.</w:t>
+        <w:t>Kesanggupan Pembayaran Angsuran Kredit Perbulan Diatas 70% dari Uang Pensiun atau Manfaat Pensiun Bulanan Yang Diterima.{{#list_syarat_tambahan}}</w:t>
       </w:r>
     </w:p>
     <w:p>
@@ -4621,7 +4654,7 @@
           <w:sz w:val="20"/>
           <w:szCs w:val="20"/>
         </w:rPr>
-        <w:t>Menyerahkan Asli SK Pensiun atas nama Pemohon sebagai Jaminan Kredit BNI.</w:t>
+        <w:t>{{text}}{{/list_syarat_tambahan}}{{#list_syarat_penandatanganan}}</w:t>
       </w:r>
     </w:p>
     <w:p>
@@ -4648,7 +4681,7 @@
           <w:sz w:val="20"/>
           <w:szCs w:val="20"/>
         </w:rPr>
-        <w:t>Jaminan yang telah ada sebelumnya berupa Asli SK Pensiun atas nama Pemohon tetap dipertahankan sebagai Jaminan Kredit di BNI.</w:t>
+        <w:t>{{text}}{{/list_syarat_penandatanganan}}</w:t>
       </w:r>
     </w:p>
     <w:p>
@@ -4670,75 +4703,22 @@
       </w:pPr>
       <w:r>
         <w:rPr>
-          <w:rFonts w:hint="default" w:ascii="Kalinga" w:hAnsi="Kalinga" w:cs="Kalinga"/>
-          <w:sz w:val="20"/>
-          <w:szCs w:val="20"/>
-          <w:lang w:val="en-US"/>
-        </w:rPr>
-        <w:t xml:space="preserve">Fasilitas kredit ini saling mengkait dengan fasilitas kredit sebelumnya nomor rekening pinjaman </w:t>
-      </w:r>
-      <w:r>
-        <w:rPr>
-          <w:rFonts w:hint="default" w:ascii="Kalinga" w:hAnsi="Kalinga"/>
-          <w:sz w:val="20"/>
-          <w:szCs w:val="20"/>
-          <w:lang w:val="en-US"/>
-        </w:rPr>
-        <w:t xml:space="preserve">                                                                                                                                        </w:t>
-      </w:r>
-      <w:r>
-        <w:rPr>
-          <w:rFonts w:hint="default" w:ascii="Kalinga" w:hAnsi="Kalinga"/>
-          <w:sz w:val="20"/>
-          <w:szCs w:val="20"/>
-        </w:rPr>
-        <w:t xml:space="preserve">                                                                        atas nama </w:t>
-      </w:r>
-      <w:r>
-        <w:rPr>
-          <w:rFonts w:hint="default" w:ascii="Kalinga" w:hAnsi="Kalinga"/>
-          <w:color w:val="auto"/>
-          <w:sz w:val="20"/>
-          <w:szCs w:val="20"/>
-          <w:lang w:val="en-US"/>
-        </w:rPr>
-        <w:t>{{nama_pemohon}}</w:t>
-      </w:r>
-      <w:r>
-        <w:rPr>
-          <w:rFonts w:hint="default" w:ascii="Kalinga" w:hAnsi="Kalinga"/>
-          <w:sz w:val="20"/>
-          <w:szCs w:val="20"/>
-          <w:lang w:val="en-US"/>
-        </w:rPr>
-        <w:t xml:space="preserve">, No. PK </w:t>
-      </w:r>
-    </w:p>
-    <w:p>
-      <w:pPr>
-        <w:pStyle w:val="6"/>
-        <w:numPr>
-          <w:ilvl w:val="0"/>
-          <w:numId w:val="1"/>
-        </w:numPr>
-        <w:spacing w:line="240" w:lineRule="auto"/>
-        <w:ind w:left="360" w:leftChars="0" w:right="160" w:rightChars="0" w:hanging="280" w:firstLineChars="0"/>
-        <w:jc w:val="both"/>
-        <w:rPr>
-          <w:rFonts w:hint="default" w:ascii="Kalinga" w:hAnsi="Kalinga"/>
-          <w:color w:val="auto"/>
-          <w:sz w:val="20"/>
-          <w:szCs w:val="20"/>
-        </w:rPr>
-      </w:pPr>
-      <w:r>
-        <w:rPr>
-          <w:rFonts w:hint="default" w:ascii="Kalinga" w:hAnsi="Kalinga"/>
-          <w:color w:val="auto"/>
-          <w:sz w:val="20"/>
-          <w:szCs w:val="20"/>
-        </w:rPr>
-        <w:t>Download dan Aktivasi aplikasi WONDR, serta melakukan trial minimal 1 (satu) Transaksi berbayar. (Cfm Surat W11/3.5/2166 Penegasan Program WONDR).</w:t>
+          <w:rFonts w:hint="default" w:ascii="Kalinga" w:hAnsi="Kalinga"/>
+          <w:color w:val="auto"/>
+          <w:sz w:val="20"/>
+          <w:szCs w:val="20"/>
+          <w:lang w:val="en-US"/>
+        </w:rPr>
+        <w:t>S</w:t>
+      </w:r>
+      <w:r>
+        <w:rPr>
+          <w:rFonts w:hint="default" w:ascii="Kalinga" w:hAnsi="Kalinga"/>
+          <w:color w:val="auto"/>
+          <w:sz w:val="20"/>
+          <w:szCs w:val="20"/>
+        </w:rPr>
+        <w:t>erta melakukan trial minimal 1 (satu) Transaksi berbayar. (Cfm Surat W11/3.5/2166 Penegasan Program WONDR).</w:t>
       </w:r>
     </w:p>
     <w:p>
@@ -4994,7 +4974,7 @@
           <w:szCs w:val="20"/>
           <w:lang w:val="en-US"/>
         </w:rPr>
-        <w:t>.</w:t>
+        <w:t>.{{#list_syarat_pencairan_tambahan}}</w:t>
       </w:r>
     </w:p>
     <w:p>
@@ -5021,26 +5001,19 @@
           <w:sz w:val="20"/>
           <w:szCs w:val="20"/>
         </w:rPr>
-        <w:t xml:space="preserve">Rekening BNI Taplus nomor {{payroll_no_rek}} atas nama {{nama_pemohon}} yang </w:t>
-      </w:r>
-      <w:r>
-        <w:rPr>
-          <w:rFonts w:hint="default" w:ascii="Kalinga" w:hAnsi="Kalinga"/>
-          <w:color w:val="auto"/>
-          <w:sz w:val="20"/>
-          <w:szCs w:val="20"/>
-          <w:lang w:val="en-US"/>
-        </w:rPr>
-        <w:t xml:space="preserve">menjadi </w:t>
-      </w:r>
-      <w:r>
-        <w:rPr>
-          <w:rFonts w:hint="default" w:ascii="Kalinga" w:hAnsi="Kalinga"/>
-          <w:color w:val="auto"/>
-          <w:sz w:val="20"/>
-          <w:szCs w:val="20"/>
-        </w:rPr>
-        <w:t>Rekening Payroll Gaji Pensiun akan dijadikan sebagai Rekening Afiliasi Kredit dan diblokir sebesar  () kali angsuran (Pokok+ Bunga serta ditambah saldo minimum, dapat dibuka blokir saat kredit lunas). Dana ini dapat dipotong dari Pencairan Kredit.</w:t>
+        <w:t>{{text}}</w:t>
+      </w:r>
+      <w:bookmarkStart w:id="17" w:name="_GoBack"/>
+      <w:bookmarkEnd w:id="17"/>
+      <w:r>
+        <w:rPr>
+          <w:rFonts w:hint="default" w:ascii="Kalinga" w:hAnsi="Kalinga"/>
+          <w:color w:val="auto"/>
+          <w:sz w:val="20"/>
+          <w:szCs w:val="20"/>
+          <w:lang w:val="en-US"/>
+        </w:rPr>
+        <w:t>{{/list_syarat_pencairan_tambahan}}</w:t>
       </w:r>
     </w:p>
     <w:p>
@@ -5067,45 +5040,7 @@
           <w:sz w:val="20"/>
           <w:szCs w:val="20"/>
         </w:rPr>
-        <w:t xml:space="preserve">Rekening BNI Taplus atas nama Pemohon yang </w:t>
-      </w:r>
-      <w:r>
-        <w:rPr>
-          <w:rFonts w:hint="default" w:ascii="Kalinga" w:hAnsi="Kalinga"/>
-          <w:color w:val="auto"/>
-          <w:sz w:val="20"/>
-          <w:szCs w:val="20"/>
-          <w:lang w:val="en-US"/>
-        </w:rPr>
-        <w:t>menjadi</w:t>
-      </w:r>
-      <w:r>
-        <w:rPr>
-          <w:rFonts w:hint="default" w:ascii="Kalinga" w:hAnsi="Kalinga"/>
-          <w:color w:val="auto"/>
-          <w:sz w:val="20"/>
-          <w:szCs w:val="20"/>
-        </w:rPr>
-        <w:t xml:space="preserve"> Rekening Payroll Gaji Pensiun </w:t>
-      </w:r>
-      <w:r>
-        <w:rPr>
-          <w:rFonts w:hint="default" w:ascii="Kalinga" w:hAnsi="Kalinga"/>
-          <w:color w:val="auto"/>
-          <w:sz w:val="20"/>
-          <w:szCs w:val="20"/>
-          <w:lang w:val="en-US"/>
-        </w:rPr>
-        <w:t xml:space="preserve">akan </w:t>
-      </w:r>
-      <w:r>
-        <w:rPr>
-          <w:rFonts w:hint="default" w:ascii="Kalinga" w:hAnsi="Kalinga"/>
-          <w:color w:val="auto"/>
-          <w:sz w:val="20"/>
-          <w:szCs w:val="20"/>
-        </w:rPr>
-        <w:t>dijadikan sebagai Rekening Afiliasi Kredit dan diblokir sebesar () kali angsuran () kali angsuran Pindah Gaji (dapat dibuka setelah Gaji Pensiun telah tercermin di Rekening Afiliasi Kredit BNI) dan  () kali angsuran (Pokok+ Bunga serta ditambah saldo minimum, dapat dibuka blokir saat kredit lunas). Dana ini dapat dipotong dari Pencairan Kredit.</w:t>
+        <w:t>{{syarat_pencairan_kredit}}</w:t>
       </w:r>
     </w:p>
     <w:p>

</xml_diff>

<commit_message>
Update SLIK/Usulan forms, add MentionTextArea, and document template improvements
</commit_message>
<xml_diff>
--- a/frontend/templates/template_purna.docx
+++ b/frontend/templates/template_purna.docx
@@ -16,8 +16,8 @@
           <w:u w:val="single"/>
         </w:rPr>
       </w:pPr>
-      <w:bookmarkStart w:id="0" w:name="OLE_LINK2"/>
-      <w:bookmarkStart w:id="1" w:name="OLE_LINK30"/>
+      <w:bookmarkStart w:id="0" w:name="OLE_LINK30"/>
+      <w:bookmarkStart w:id="1" w:name="OLE_LINK2"/>
       <w:r>
         <w:rPr>
           <w:rFonts w:ascii="Kalinga" w:hAnsi="Kalinga" w:cs="Kalinga"/>
@@ -3897,16 +3897,16 @@
         </w:rPr>
       </w:pPr>
       <w:bookmarkStart w:id="3" w:name="OLE_LINK19"/>
-      <w:bookmarkStart w:id="4" w:name="OLE_LINK8"/>
-      <w:bookmarkStart w:id="5" w:name="OLE_LINK17"/>
-      <w:bookmarkStart w:id="6" w:name="OLE_LINK10"/>
-      <w:bookmarkStart w:id="7" w:name="OLE_LINK32"/>
-      <w:bookmarkStart w:id="8" w:name="OLE_LINK41"/>
-      <w:bookmarkStart w:id="9" w:name="OLE_LINK27"/>
-      <w:bookmarkStart w:id="10" w:name="OLE_LINK24"/>
-      <w:bookmarkStart w:id="11" w:name="OLE_LINK33"/>
-      <w:bookmarkStart w:id="12" w:name="OLE_LINK3"/>
-      <w:bookmarkStart w:id="13" w:name="OLE_LINK23"/>
+      <w:bookmarkStart w:id="4" w:name="OLE_LINK17"/>
+      <w:bookmarkStart w:id="5" w:name="OLE_LINK8"/>
+      <w:bookmarkStart w:id="6" w:name="OLE_LINK32"/>
+      <w:bookmarkStart w:id="7" w:name="OLE_LINK41"/>
+      <w:bookmarkStart w:id="8" w:name="OLE_LINK10"/>
+      <w:bookmarkStart w:id="9" w:name="OLE_LINK33"/>
+      <w:bookmarkStart w:id="10" w:name="OLE_LINK23"/>
+      <w:bookmarkStart w:id="11" w:name="OLE_LINK3"/>
+      <w:bookmarkStart w:id="12" w:name="OLE_LINK27"/>
+      <w:bookmarkStart w:id="13" w:name="OLE_LINK24"/>
       <w:r>
         <w:rPr>
           <w:rFonts w:ascii="Kalinga" w:hAnsi="Kalinga" w:cs="Kalinga"/>
@@ -4036,17 +4036,6 @@
       </w:r>
       <w:r>
         <w:rPr>
-          <w:rFonts w:ascii="Kalinga" w:hAnsi="Kalinga" w:eastAsia="SimSun" w:cs="Kalinga"/>
-          <w:b/>
-          <w:bCs/>
-          <w:color w:val="auto"/>
-          <w:sz w:val="20"/>
-          <w:szCs w:val="20"/>
-        </w:rPr>
-        <w:t xml:space="preserve"> </w:t>
-      </w:r>
-      <w:r>
-        <w:rPr>
           <w:rFonts w:ascii="Kalinga" w:hAnsi="Kalinga" w:cs="Kalinga"/>
           <w:b/>
           <w:bCs/>
@@ -4273,19 +4262,23 @@
     </w:p>
     <w:p>
       <w:pPr>
-        <w:spacing w:after="0" w:line="240" w:lineRule="auto"/>
-        <w:ind w:left="0" w:leftChars="0" w:firstLine="0" w:firstLineChars="0"/>
-        <w:jc w:val="both"/>
+        <w:pStyle w:val="6"/>
+        <w:numPr>
+          <w:numId w:val="0"/>
+        </w:numPr>
+        <w:spacing w:line="240" w:lineRule="auto"/>
+        <w:ind w:left="80" w:leftChars="0" w:right="160" w:rightChars="0"/>
+        <w:jc w:val="both"/>
+        <w:rPr>
+          <w:rFonts w:hint="default" w:ascii="Kalinga" w:hAnsi="Kalinga"/>
+          <w:color w:val="auto"/>
+          <w:sz w:val="20"/>
+          <w:szCs w:val="20"/>
+        </w:rPr>
+      </w:pPr>
+      <w:r>
         <w:rPr>
           <w:rFonts w:ascii="Kalinga" w:hAnsi="Kalinga" w:cs="Kalinga"/>
-          <w:color w:val="auto"/>
-          <w:sz w:val="20"/>
-          <w:szCs w:val="20"/>
-        </w:rPr>
-      </w:pPr>
-      <w:r>
-        <w:rPr>
-          <w:rFonts w:ascii="Kalinga" w:hAnsi="Kalinga" w:cs="Kalinga"/>
           <w:b/>
           <w:bCs/>
           <w:color w:val="auto"/>
@@ -4293,6 +4286,19 @@
           <w:szCs w:val="20"/>
         </w:rPr>
         <w:t>Syarat Penandatanganan :</w:t>
+      </w:r>
+      <w:bookmarkEnd w:id="4"/>
+      <w:bookmarkEnd w:id="5"/>
+      <w:bookmarkStart w:id="14" w:name="OLE_LINK34"/>
+      <w:bookmarkStart w:id="15" w:name="OLE_LINK16"/>
+      <w:r>
+        <w:rPr>
+          <w:rFonts w:hint="default" w:ascii="Kalinga" w:hAnsi="Kalinga"/>
+          <w:color w:val="auto"/>
+          <w:sz w:val="20"/>
+          <w:szCs w:val="20"/>
+        </w:rPr>
+        <w:t>{{#list_syarat_penandatanganan}}</w:t>
       </w:r>
     </w:p>
     <w:p>
@@ -4306,369 +4312,7 @@
         <w:ind w:left="360" w:leftChars="0" w:right="160" w:rightChars="0" w:hanging="280" w:firstLineChars="0"/>
         <w:jc w:val="both"/>
         <w:rPr>
-          <w:rFonts w:hint="default" w:ascii="Kalinga" w:hAnsi="Kalinga"/>
-          <w:color w:val="auto"/>
-          <w:sz w:val="20"/>
-          <w:szCs w:val="20"/>
-        </w:rPr>
-      </w:pPr>
-      <w:r>
-        <w:rPr>
-          <w:rFonts w:hint="default" w:ascii="Kalinga" w:hAnsi="Kalinga"/>
-          <w:color w:val="auto"/>
-          <w:sz w:val="20"/>
-          <w:szCs w:val="20"/>
-          <w:lang w:val="en-US"/>
-        </w:rPr>
-        <w:t>Aplikasi permohonan kredit telah di tanda tangani oleh Pemohon.</w:t>
-      </w:r>
-    </w:p>
-    <w:p>
-      <w:pPr>
-        <w:pStyle w:val="6"/>
-        <w:numPr>
-          <w:ilvl w:val="0"/>
-          <w:numId w:val="1"/>
-        </w:numPr>
-        <w:spacing w:line="240" w:lineRule="auto"/>
-        <w:ind w:left="360" w:leftChars="0" w:right="160" w:rightChars="0" w:hanging="280" w:firstLineChars="0"/>
-        <w:jc w:val="both"/>
-        <w:rPr>
-          <w:rFonts w:hint="default" w:ascii="Kalinga" w:hAnsi="Kalinga"/>
-          <w:color w:val="auto"/>
-          <w:sz w:val="20"/>
-          <w:szCs w:val="20"/>
-        </w:rPr>
-      </w:pPr>
-      <w:r>
-        <w:rPr>
-          <w:rFonts w:ascii="Kalinga" w:hAnsi="Kalinga" w:cs="Kalinga"/>
-          <w:color w:val="auto"/>
-          <w:sz w:val="20"/>
-          <w:szCs w:val="20"/>
-        </w:rPr>
-        <w:t>P</w:t>
-      </w:r>
-      <w:bookmarkEnd w:id="4"/>
-      <w:bookmarkEnd w:id="5"/>
-      <w:bookmarkStart w:id="14" w:name="OLE_LINK34"/>
-      <w:bookmarkStart w:id="15" w:name="OLE_LINK16"/>
-      <w:r>
-        <w:rPr>
-          <w:rFonts w:hint="default" w:ascii="Kalinga" w:hAnsi="Kalinga"/>
-          <w:color w:val="auto"/>
-          <w:sz w:val="20"/>
-          <w:szCs w:val="20"/>
-        </w:rPr>
-        <w:t>emohon Wajib ditutup Asuransi Jiwa selama Jangka Waktu Kredit.</w:t>
-      </w:r>
-    </w:p>
-    <w:p>
-      <w:pPr>
-        <w:pStyle w:val="6"/>
-        <w:numPr>
-          <w:ilvl w:val="0"/>
-          <w:numId w:val="1"/>
-        </w:numPr>
-        <w:spacing w:line="240" w:lineRule="auto"/>
-        <w:ind w:left="360" w:leftChars="0" w:right="160" w:rightChars="0" w:hanging="280" w:firstLineChars="0"/>
-        <w:jc w:val="both"/>
-        <w:rPr>
-          <w:rFonts w:hint="default" w:ascii="Kalinga" w:hAnsi="Kalinga"/>
-          <w:color w:val="auto"/>
-          <w:sz w:val="20"/>
-          <w:szCs w:val="20"/>
-        </w:rPr>
-      </w:pPr>
-      <w:r>
-        <w:rPr>
-          <w:rFonts w:hint="default" w:ascii="Kalinga" w:hAnsi="Kalinga"/>
-          <w:color w:val="auto"/>
-          <w:sz w:val="20"/>
-          <w:szCs w:val="20"/>
-        </w:rPr>
-        <w:t>Biaya Pro</w:t>
-      </w:r>
-      <w:r>
-        <w:rPr>
-          <w:rFonts w:hint="default" w:ascii="Kalinga" w:hAnsi="Kalinga"/>
-          <w:color w:val="auto"/>
-          <w:sz w:val="20"/>
-          <w:szCs w:val="20"/>
-          <w:lang w:val="en-US"/>
-        </w:rPr>
-        <w:t>v</w:t>
-      </w:r>
-      <w:r>
-        <w:rPr>
-          <w:rFonts w:hint="default" w:ascii="Kalinga" w:hAnsi="Kalinga"/>
-          <w:color w:val="auto"/>
-          <w:sz w:val="20"/>
-          <w:szCs w:val="20"/>
-        </w:rPr>
-        <w:t xml:space="preserve">isi </w:t>
-      </w:r>
-      <w:r>
-        <w:rPr>
-          <w:rFonts w:hint="default" w:ascii="Kalinga" w:hAnsi="Kalinga"/>
-          <w:color w:val="auto"/>
-          <w:sz w:val="20"/>
-          <w:szCs w:val="20"/>
-          <w:lang w:val="en-US"/>
-        </w:rPr>
-        <w:t>1</w:t>
-      </w:r>
-      <w:r>
-        <w:rPr>
-          <w:rFonts w:hint="default" w:ascii="Kalinga" w:hAnsi="Kalinga"/>
-          <w:color w:val="auto"/>
-          <w:sz w:val="20"/>
-          <w:szCs w:val="20"/>
-        </w:rPr>
-        <w:t xml:space="preserve">% dari Maksimum Kredit atau sebesar Rp. {{biaya_provisi}},- Biaya Tata Laksana </w:t>
-      </w:r>
-      <w:r>
-        <w:rPr>
-          <w:rFonts w:hint="default" w:ascii="Kalinga" w:hAnsi="Kalinga"/>
-          <w:color w:val="auto"/>
-          <w:sz w:val="20"/>
-          <w:szCs w:val="20"/>
-          <w:lang w:val="en-US"/>
-        </w:rPr>
-        <w:t>2</w:t>
-      </w:r>
-      <w:r>
-        <w:rPr>
-          <w:rFonts w:hint="default" w:ascii="Kalinga" w:hAnsi="Kalinga"/>
-          <w:color w:val="auto"/>
-          <w:sz w:val="20"/>
-          <w:szCs w:val="20"/>
-        </w:rPr>
-        <w:t>% dari maksimum kredit atau sebesar Rp. {{biaya_tatalaksana}} dan Bebas Biaya Administrasi</w:t>
-      </w:r>
-      <w:r>
-        <w:rPr>
-          <w:rFonts w:hint="default" w:ascii="Kalinga" w:hAnsi="Kalinga"/>
-          <w:color w:val="auto"/>
-          <w:sz w:val="20"/>
-          <w:szCs w:val="20"/>
-          <w:lang w:val="en-US"/>
-        </w:rPr>
-        <w:t xml:space="preserve">. </w:t>
-      </w:r>
-      <w:r>
-        <w:rPr>
-          <w:rFonts w:hint="default" w:ascii="Kalinga" w:hAnsi="Kalinga"/>
-          <w:color w:val="auto"/>
-          <w:sz w:val="20"/>
-          <w:szCs w:val="20"/>
-        </w:rPr>
-        <w:t>{{catatan_program_pricing}}</w:t>
-      </w:r>
-    </w:p>
-    <w:p>
-      <w:pPr>
-        <w:pStyle w:val="6"/>
-        <w:numPr>
-          <w:ilvl w:val="0"/>
-          <w:numId w:val="1"/>
-        </w:numPr>
-        <w:spacing w:line="240" w:lineRule="auto"/>
-        <w:ind w:left="360" w:leftChars="0" w:right="160" w:rightChars="0" w:hanging="280" w:firstLineChars="0"/>
-        <w:jc w:val="both"/>
-        <w:rPr>
-          <w:rFonts w:hint="default" w:ascii="Kalinga" w:hAnsi="Kalinga"/>
-          <w:color w:val="auto"/>
-          <w:sz w:val="20"/>
-          <w:szCs w:val="20"/>
-        </w:rPr>
-      </w:pPr>
-      <w:r>
-        <w:rPr>
-          <w:rFonts w:hint="default" w:ascii="Kalinga" w:hAnsi="Kalinga"/>
-          <w:color w:val="auto"/>
-          <w:sz w:val="20"/>
-          <w:szCs w:val="20"/>
-        </w:rPr>
-        <w:t>Rekening BNI Taplus nomor {{payroll_no_rek}} atas nama {{nama_pemohon}} yang menjadi Rekening Payroll Gaji Pensiun akan dijadikan sebagai Rekening Afiliasi Kredit.</w:t>
-      </w:r>
-    </w:p>
-    <w:p>
-      <w:pPr>
-        <w:pStyle w:val="6"/>
-        <w:numPr>
-          <w:ilvl w:val="0"/>
-          <w:numId w:val="1"/>
-        </w:numPr>
-        <w:spacing w:line="240" w:lineRule="auto"/>
-        <w:ind w:left="360" w:leftChars="0" w:right="160" w:rightChars="0" w:hanging="280" w:firstLineChars="0"/>
-        <w:jc w:val="both"/>
-        <w:rPr>
-          <w:rFonts w:hint="default" w:ascii="Kalinga" w:hAnsi="Kalinga"/>
-          <w:color w:val="auto"/>
-          <w:sz w:val="20"/>
-          <w:szCs w:val="20"/>
-        </w:rPr>
-      </w:pPr>
-      <w:r>
-        <w:rPr>
-          <w:rFonts w:hint="default" w:ascii="Kalinga" w:hAnsi="Kalinga"/>
-          <w:color w:val="auto"/>
-          <w:sz w:val="20"/>
-          <w:szCs w:val="20"/>
-        </w:rPr>
-        <w:t>Membuka Rekening BNI Taplus atas nama pemohon yang menjadi Rekening Payroll Gaji Pensiun dan dijadikan sebagai Rekening Afiliasi Kredit.</w:t>
-      </w:r>
-    </w:p>
-    <w:p>
-      <w:pPr>
-        <w:pStyle w:val="6"/>
-        <w:numPr>
-          <w:ilvl w:val="0"/>
-          <w:numId w:val="1"/>
-        </w:numPr>
-        <w:spacing w:line="240" w:lineRule="auto"/>
-        <w:ind w:left="360" w:leftChars="0" w:right="160" w:rightChars="0" w:hanging="280" w:firstLineChars="0"/>
-        <w:jc w:val="both"/>
-        <w:rPr>
-          <w:rFonts w:hint="default" w:ascii="Kalinga" w:hAnsi="Kalinga"/>
-          <w:color w:val="auto"/>
-          <w:sz w:val="20"/>
-          <w:szCs w:val="20"/>
-        </w:rPr>
-      </w:pPr>
-      <w:r>
-        <w:rPr>
-          <w:rFonts w:hint="default" w:ascii="Kalinga" w:hAnsi="Kalinga"/>
-          <w:color w:val="auto"/>
-          <w:sz w:val="20"/>
-          <w:szCs w:val="20"/>
-        </w:rPr>
-        <w:t>Menyerahkan Surat-Surat Pernyataan dan Surat Kuasa Debitur terkait pemberian Fasilitas Kredit Pensiun.</w:t>
-      </w:r>
-    </w:p>
-    <w:p>
-      <w:pPr>
-        <w:pStyle w:val="6"/>
-        <w:numPr>
-          <w:ilvl w:val="0"/>
-          <w:numId w:val="1"/>
-        </w:numPr>
-        <w:spacing w:line="240" w:lineRule="auto"/>
-        <w:ind w:left="360" w:leftChars="0" w:right="160" w:rightChars="0" w:hanging="280" w:firstLineChars="0"/>
-        <w:jc w:val="both"/>
-        <w:rPr>
-          <w:rFonts w:hint="default" w:ascii="Kalinga" w:hAnsi="Kalinga"/>
-          <w:color w:val="auto"/>
-          <w:sz w:val="20"/>
-          <w:szCs w:val="20"/>
-        </w:rPr>
-      </w:pPr>
-      <w:r>
-        <w:rPr>
-          <w:rFonts w:hint="default" w:ascii="Kalinga" w:hAnsi="Kalinga"/>
-          <w:color w:val="auto"/>
-          <w:sz w:val="20"/>
-          <w:szCs w:val="20"/>
-        </w:rPr>
-        <w:t>Menyerahkan Surat Pernyataan Siap Melakukan Pembayaran Apabila suatu saat Kehilangan Tunjangan</w:t>
-      </w:r>
-      <w:r>
-        <w:rPr>
-          <w:rFonts w:hint="default" w:ascii="Kalinga" w:hAnsi="Kalinga"/>
-          <w:color w:val="auto"/>
-          <w:sz w:val="20"/>
-          <w:szCs w:val="20"/>
-          <w:lang w:val="en-US"/>
-        </w:rPr>
-        <w:t>.</w:t>
-      </w:r>
-    </w:p>
-    <w:p>
-      <w:pPr>
-        <w:pStyle w:val="6"/>
-        <w:numPr>
-          <w:ilvl w:val="0"/>
-          <w:numId w:val="1"/>
-        </w:numPr>
-        <w:spacing w:line="240" w:lineRule="auto"/>
-        <w:ind w:left="360" w:leftChars="0" w:right="160" w:rightChars="0" w:hanging="280" w:firstLineChars="0"/>
-        <w:jc w:val="both"/>
-        <w:rPr>
-          <w:rFonts w:hint="default" w:ascii="Kalinga" w:hAnsi="Kalinga"/>
-          <w:color w:val="auto"/>
-          <w:sz w:val="20"/>
-          <w:szCs w:val="20"/>
-        </w:rPr>
-      </w:pPr>
-      <w:r>
-        <w:rPr>
-          <w:rFonts w:hint="default" w:ascii="Kalinga" w:hAnsi="Kalinga"/>
-          <w:color w:val="auto"/>
-          <w:sz w:val="20"/>
-          <w:szCs w:val="20"/>
-        </w:rPr>
-        <w:t xml:space="preserve">Menyerahkan Surat </w:t>
-      </w:r>
-      <w:r>
-        <w:rPr>
-          <w:rFonts w:hint="default" w:ascii="Kalinga" w:hAnsi="Kalinga"/>
-          <w:color w:val="auto"/>
-          <w:sz w:val="20"/>
-          <w:szCs w:val="20"/>
-          <w:lang w:val="en-US"/>
-        </w:rPr>
-        <w:t xml:space="preserve">Pernyataan </w:t>
-      </w:r>
-      <w:r>
-        <w:rPr>
-          <w:rFonts w:hint="default" w:ascii="Kalinga" w:hAnsi="Kalinga"/>
-          <w:color w:val="auto"/>
-          <w:sz w:val="20"/>
-          <w:szCs w:val="20"/>
-        </w:rPr>
-        <w:t>Kesanggupan Pembayaran Angsuran Kredit Perbulan Diatas 70% dari Uang Pensiun atau Manfaat Pensiun Bulanan Yang Diterima.{{#list_syarat_tambahan}}</w:t>
-      </w:r>
-    </w:p>
-    <w:p>
-      <w:pPr>
-        <w:pStyle w:val="6"/>
-        <w:numPr>
-          <w:ilvl w:val="0"/>
-          <w:numId w:val="1"/>
-        </w:numPr>
-        <w:spacing w:line="240" w:lineRule="auto"/>
-        <w:ind w:left="360" w:leftChars="0" w:right="160" w:rightChars="0" w:hanging="280" w:firstLineChars="0"/>
-        <w:jc w:val="both"/>
-        <w:rPr>
-          <w:rFonts w:hint="default" w:ascii="Kalinga" w:hAnsi="Kalinga"/>
-          <w:color w:val="auto"/>
-          <w:sz w:val="20"/>
-          <w:szCs w:val="20"/>
-        </w:rPr>
-      </w:pPr>
-      <w:r>
-        <w:rPr>
-          <w:rFonts w:hint="default" w:ascii="Kalinga" w:hAnsi="Kalinga"/>
-          <w:color w:val="auto"/>
-          <w:sz w:val="20"/>
-          <w:szCs w:val="20"/>
-        </w:rPr>
-        <w:t>{{text}}{{/list_syarat_tambahan}}{{#list_syarat_penandatanganan}}</w:t>
-      </w:r>
-    </w:p>
-    <w:p>
-      <w:pPr>
-        <w:pStyle w:val="6"/>
-        <w:numPr>
-          <w:ilvl w:val="0"/>
-          <w:numId w:val="1"/>
-        </w:numPr>
-        <w:spacing w:line="240" w:lineRule="auto"/>
-        <w:ind w:left="360" w:leftChars="0" w:right="160" w:rightChars="0" w:hanging="280" w:firstLineChars="0"/>
-        <w:jc w:val="both"/>
-        <w:rPr>
-          <w:rFonts w:hint="default" w:ascii="Kalinga" w:hAnsi="Kalinga"/>
+          <w:rFonts w:hint="default" w:ascii="Kalinga" w:hAnsi="Kalinga" w:cs="Kalinga"/>
           <w:color w:val="auto"/>
           <w:sz w:val="20"/>
           <w:szCs w:val="20"/>
@@ -4682,97 +4326,6 @@
           <w:szCs w:val="20"/>
         </w:rPr>
         <w:t>{{text}}{{/list_syarat_penandatanganan}}</w:t>
-      </w:r>
-    </w:p>
-    <w:p>
-      <w:pPr>
-        <w:pStyle w:val="6"/>
-        <w:numPr>
-          <w:ilvl w:val="0"/>
-          <w:numId w:val="1"/>
-        </w:numPr>
-        <w:spacing w:line="240" w:lineRule="auto"/>
-        <w:ind w:left="360" w:leftChars="0" w:right="160" w:rightChars="0" w:hanging="280" w:firstLineChars="0"/>
-        <w:jc w:val="both"/>
-        <w:rPr>
-          <w:rFonts w:hint="default" w:ascii="Kalinga" w:hAnsi="Kalinga"/>
-          <w:color w:val="auto"/>
-          <w:sz w:val="20"/>
-          <w:szCs w:val="20"/>
-        </w:rPr>
-      </w:pPr>
-      <w:r>
-        <w:rPr>
-          <w:rFonts w:hint="default" w:ascii="Kalinga" w:hAnsi="Kalinga"/>
-          <w:color w:val="auto"/>
-          <w:sz w:val="20"/>
-          <w:szCs w:val="20"/>
-          <w:lang w:val="en-US"/>
-        </w:rPr>
-        <w:t>S</w:t>
-      </w:r>
-      <w:r>
-        <w:rPr>
-          <w:rFonts w:hint="default" w:ascii="Kalinga" w:hAnsi="Kalinga"/>
-          <w:color w:val="auto"/>
-          <w:sz w:val="20"/>
-          <w:szCs w:val="20"/>
-        </w:rPr>
-        <w:t>erta melakukan trial minimal 1 (satu) Transaksi berbayar. (Cfm Surat W11/3.5/2166 Penegasan Program WONDR).</w:t>
-      </w:r>
-    </w:p>
-    <w:p>
-      <w:pPr>
-        <w:pStyle w:val="6"/>
-        <w:numPr>
-          <w:ilvl w:val="0"/>
-          <w:numId w:val="1"/>
-        </w:numPr>
-        <w:spacing w:line="240" w:lineRule="auto"/>
-        <w:ind w:left="360" w:leftChars="0" w:right="160" w:rightChars="0" w:hanging="280" w:firstLineChars="0"/>
-        <w:jc w:val="both"/>
-        <w:rPr>
-          <w:rFonts w:hint="default" w:ascii="Kalinga" w:hAnsi="Kalinga"/>
-          <w:color w:val="auto"/>
-          <w:sz w:val="20"/>
-          <w:szCs w:val="20"/>
-        </w:rPr>
-      </w:pPr>
-      <w:r>
-        <w:rPr>
-          <w:rFonts w:hint="default" w:ascii="Kalinga" w:hAnsi="Kalinga"/>
-          <w:color w:val="auto"/>
-          <w:sz w:val="20"/>
-          <w:szCs w:val="20"/>
-        </w:rPr>
-        <w:t>Biaya pelunasan sebelum jatuh tempo (PSJT ) sebesar {{biaya_psjt_persen | default('0', true)}}% dari outstanding  kredit.</w:t>
-      </w:r>
-    </w:p>
-    <w:p>
-      <w:pPr>
-        <w:pStyle w:val="6"/>
-        <w:numPr>
-          <w:ilvl w:val="0"/>
-          <w:numId w:val="1"/>
-        </w:numPr>
-        <w:spacing w:line="240" w:lineRule="auto"/>
-        <w:ind w:left="360" w:leftChars="0" w:right="160" w:rightChars="0" w:hanging="280" w:firstLineChars="0"/>
-        <w:jc w:val="both"/>
-        <w:rPr>
-          <w:rFonts w:ascii="Kalinga" w:hAnsi="Kalinga" w:cs="Kalinga"/>
-          <w:color w:val="auto"/>
-          <w:sz w:val="20"/>
-          <w:szCs w:val="20"/>
-        </w:rPr>
-      </w:pPr>
-      <w:r>
-        <w:rPr>
-          <w:rFonts w:hint="default" w:ascii="Kalinga" w:hAnsi="Kalinga"/>
-          <w:color w:val="auto"/>
-          <w:sz w:val="20"/>
-          <w:szCs w:val="20"/>
-        </w:rPr>
-        <w:t>Lainnya Cfm. Ketentuan BNI Fleksi Pensiun dan Ketentuan yang berlaku.</w:t>
       </w:r>
     </w:p>
     <w:p>
@@ -4827,24 +4380,42 @@
     </w:p>
     <w:p>
       <w:pPr>
-        <w:spacing w:after="0" w:line="240" w:lineRule="auto"/>
-        <w:ind w:left="0" w:leftChars="0" w:firstLine="0" w:firstLineChars="0"/>
-        <w:jc w:val="both"/>
+        <w:pStyle w:val="6"/>
+        <w:numPr>
+          <w:numId w:val="0"/>
+        </w:numPr>
+        <w:spacing w:line="240" w:lineRule="auto"/>
+        <w:ind w:left="80" w:leftChars="0" w:right="160" w:rightChars="0"/>
+        <w:jc w:val="both"/>
+        <w:rPr>
+          <w:rFonts w:hint="default" w:ascii="Kalinga" w:hAnsi="Kalinga"/>
+          <w:color w:val="auto"/>
+          <w:sz w:val="20"/>
+          <w:szCs w:val="20"/>
+          <w:lang w:val="en-US"/>
+        </w:rPr>
+      </w:pPr>
+      <w:bookmarkStart w:id="17" w:name="_GoBack"/>
+      <w:bookmarkEnd w:id="17"/>
+      <w:r>
         <w:rPr>
           <w:rFonts w:ascii="Kalinga" w:hAnsi="Kalinga" w:cs="Kalinga"/>
           <w:color w:val="auto"/>
-          <w:sz w:val="6"/>
-          <w:szCs w:val="6"/>
-        </w:rPr>
-      </w:pPr>
-      <w:r>
-        <w:rPr>
-          <w:rFonts w:ascii="Kalinga" w:hAnsi="Kalinga" w:cs="Kalinga"/>
-          <w:color w:val="auto"/>
           <w:sz w:val="20"/>
           <w:szCs w:val="20"/>
         </w:rPr>
         <w:t>Pencairan Kredit BNI Fleksi Pensiun akan dilakukan dengan tahap sebagai berikut :</w:t>
+      </w:r>
+      <w:bookmarkEnd w:id="16"/>
+      <w:r>
+        <w:rPr>
+          <w:rFonts w:hint="default" w:ascii="Kalinga" w:hAnsi="Kalinga"/>
+          <w:color w:val="auto"/>
+          <w:sz w:val="20"/>
+          <w:szCs w:val="20"/>
+          <w:lang w:val="en-US"/>
+        </w:rPr>
+        <w:t>{{#list_syarat_pencairan}}</w:t>
       </w:r>
     </w:p>
     <w:p>
@@ -4858,319 +4429,22 @@
         <w:ind w:left="360" w:leftChars="0" w:right="160" w:rightChars="0" w:hanging="280" w:firstLineChars="0"/>
         <w:jc w:val="both"/>
         <w:rPr>
-          <w:rFonts w:hint="default" w:ascii="Kalinga" w:hAnsi="Kalinga"/>
-          <w:color w:val="auto"/>
-          <w:sz w:val="20"/>
-          <w:szCs w:val="20"/>
-        </w:rPr>
-      </w:pPr>
-      <w:r>
-        <w:rPr>
-          <w:rFonts w:hint="default" w:ascii="Kalinga" w:hAnsi="Kalinga"/>
-          <w:color w:val="auto"/>
-          <w:sz w:val="20"/>
-          <w:szCs w:val="20"/>
-        </w:rPr>
-        <w:t>Perjanjian Kredit telah ditandatangani oleh Pemohon</w:t>
-      </w:r>
-      <w:r>
-        <w:rPr>
-          <w:rFonts w:hint="default" w:ascii="Kalinga" w:hAnsi="Kalinga"/>
-          <w:color w:val="auto"/>
-          <w:sz w:val="20"/>
-          <w:szCs w:val="20"/>
-          <w:lang w:val="en-US"/>
-        </w:rPr>
-        <w:t>.</w:t>
-      </w:r>
-    </w:p>
-    <w:p>
-      <w:pPr>
-        <w:pStyle w:val="6"/>
-        <w:numPr>
-          <w:ilvl w:val="0"/>
-          <w:numId w:val="1"/>
-        </w:numPr>
-        <w:spacing w:line="240" w:lineRule="auto"/>
-        <w:ind w:left="360" w:leftChars="0" w:right="160" w:rightChars="0" w:hanging="280" w:firstLineChars="0"/>
-        <w:jc w:val="both"/>
-        <w:rPr>
-          <w:rFonts w:hint="default" w:ascii="Kalinga" w:hAnsi="Kalinga"/>
-          <w:color w:val="auto"/>
-          <w:sz w:val="20"/>
-          <w:szCs w:val="20"/>
-        </w:rPr>
-      </w:pPr>
-      <w:r>
-        <w:rPr>
-          <w:rFonts w:hint="default" w:ascii="Kalinga" w:hAnsi="Kalinga"/>
-          <w:color w:val="auto"/>
-          <w:sz w:val="20"/>
-          <w:szCs w:val="20"/>
-        </w:rPr>
-        <w:t>Telah dilakukan Penutupan Asuransi Jiwa Kredit atas nama Pemohon dibuktikan dengan Covernote dari Asuransi Rekanan BNI</w:t>
-      </w:r>
-      <w:r>
-        <w:rPr>
-          <w:rFonts w:hint="default" w:ascii="Kalinga" w:hAnsi="Kalinga"/>
-          <w:color w:val="auto"/>
-          <w:sz w:val="20"/>
-          <w:szCs w:val="20"/>
-          <w:lang w:val="en-US"/>
-        </w:rPr>
-        <w:t>.</w:t>
-      </w:r>
-    </w:p>
-    <w:p>
-      <w:pPr>
-        <w:pStyle w:val="6"/>
-        <w:numPr>
-          <w:ilvl w:val="0"/>
-          <w:numId w:val="1"/>
-        </w:numPr>
-        <w:spacing w:line="240" w:lineRule="auto"/>
-        <w:ind w:left="360" w:leftChars="0" w:right="160" w:rightChars="0" w:hanging="280" w:firstLineChars="0"/>
-        <w:jc w:val="both"/>
-        <w:rPr>
-          <w:rFonts w:hint="default" w:ascii="Kalinga" w:hAnsi="Kalinga"/>
-          <w:color w:val="auto"/>
-          <w:sz w:val="20"/>
-          <w:szCs w:val="20"/>
-        </w:rPr>
-      </w:pPr>
-      <w:r>
-        <w:rPr>
-          <w:rFonts w:hint="default" w:ascii="Kalinga" w:hAnsi="Kalinga"/>
-          <w:color w:val="auto"/>
-          <w:sz w:val="20"/>
-          <w:szCs w:val="20"/>
-        </w:rPr>
-        <w:t>Biaya Pro</w:t>
-      </w:r>
-      <w:r>
-        <w:rPr>
-          <w:rFonts w:hint="default" w:ascii="Kalinga" w:hAnsi="Kalinga"/>
-          <w:color w:val="auto"/>
-          <w:sz w:val="20"/>
-          <w:szCs w:val="20"/>
-          <w:lang w:val="en-US"/>
-        </w:rPr>
-        <w:t>v</w:t>
-      </w:r>
-      <w:r>
-        <w:rPr>
-          <w:rFonts w:hint="default" w:ascii="Kalinga" w:hAnsi="Kalinga"/>
-          <w:color w:val="auto"/>
-          <w:sz w:val="20"/>
-          <w:szCs w:val="20"/>
-        </w:rPr>
-        <w:t>isi, Tata Laksana dan Biaya lainnya (apabila ada) agar didebet dari Rekening Afiliasi atas nama Pemohon</w:t>
-      </w:r>
-      <w:r>
-        <w:rPr>
-          <w:rFonts w:hint="default" w:ascii="Kalinga" w:hAnsi="Kalinga"/>
-          <w:color w:val="auto"/>
-          <w:sz w:val="20"/>
-          <w:szCs w:val="20"/>
-          <w:lang w:val="en-US"/>
-        </w:rPr>
-        <w:t>.{{#list_syarat_pencairan_tambahan}}</w:t>
-      </w:r>
-    </w:p>
-    <w:p>
-      <w:pPr>
-        <w:pStyle w:val="6"/>
-        <w:numPr>
-          <w:ilvl w:val="0"/>
-          <w:numId w:val="1"/>
-        </w:numPr>
-        <w:spacing w:line="240" w:lineRule="auto"/>
-        <w:ind w:left="360" w:leftChars="0" w:right="160" w:rightChars="0" w:hanging="280" w:firstLineChars="0"/>
-        <w:jc w:val="both"/>
-        <w:rPr>
-          <w:rFonts w:hint="default" w:ascii="Kalinga" w:hAnsi="Kalinga"/>
-          <w:color w:val="auto"/>
-          <w:sz w:val="20"/>
-          <w:szCs w:val="20"/>
-        </w:rPr>
-      </w:pPr>
-      <w:r>
-        <w:rPr>
-          <w:rFonts w:hint="default" w:ascii="Kalinga" w:hAnsi="Kalinga"/>
-          <w:color w:val="auto"/>
-          <w:sz w:val="20"/>
-          <w:szCs w:val="20"/>
-        </w:rPr>
-        <w:t>{{text}}</w:t>
-      </w:r>
-      <w:bookmarkStart w:id="17" w:name="_GoBack"/>
-      <w:bookmarkEnd w:id="17"/>
-      <w:r>
-        <w:rPr>
-          <w:rFonts w:hint="default" w:ascii="Kalinga" w:hAnsi="Kalinga"/>
-          <w:color w:val="auto"/>
-          <w:sz w:val="20"/>
-          <w:szCs w:val="20"/>
-          <w:lang w:val="en-US"/>
-        </w:rPr>
-        <w:t>{{/list_syarat_pencairan_tambahan}}</w:t>
-      </w:r>
-    </w:p>
-    <w:p>
-      <w:pPr>
-        <w:pStyle w:val="6"/>
-        <w:numPr>
-          <w:ilvl w:val="0"/>
-          <w:numId w:val="1"/>
-        </w:numPr>
-        <w:spacing w:line="240" w:lineRule="auto"/>
-        <w:ind w:left="360" w:leftChars="0" w:right="160" w:rightChars="0" w:hanging="280" w:firstLineChars="0"/>
-        <w:jc w:val="both"/>
-        <w:rPr>
-          <w:rFonts w:hint="default" w:ascii="Kalinga" w:hAnsi="Kalinga"/>
-          <w:color w:val="auto"/>
-          <w:sz w:val="20"/>
-          <w:szCs w:val="20"/>
-        </w:rPr>
-      </w:pPr>
-      <w:r>
-        <w:rPr>
-          <w:rFonts w:hint="default" w:ascii="Kalinga" w:hAnsi="Kalinga"/>
-          <w:color w:val="auto"/>
-          <w:sz w:val="20"/>
-          <w:szCs w:val="20"/>
-        </w:rPr>
-        <w:t>{{syarat_pencairan_kredit}}</w:t>
-      </w:r>
-    </w:p>
-    <w:p>
-      <w:pPr>
-        <w:pStyle w:val="6"/>
-        <w:numPr>
-          <w:ilvl w:val="0"/>
-          <w:numId w:val="1"/>
-        </w:numPr>
-        <w:spacing w:line="240" w:lineRule="auto"/>
-        <w:ind w:left="360" w:leftChars="0" w:right="160" w:rightChars="0" w:hanging="280" w:firstLineChars="0"/>
-        <w:jc w:val="both"/>
-        <w:rPr>
-          <w:rFonts w:hint="default" w:ascii="Kalinga" w:hAnsi="Kalinga"/>
-          <w:color w:val="auto"/>
-          <w:sz w:val="20"/>
-          <w:szCs w:val="20"/>
-        </w:rPr>
-      </w:pPr>
-      <w:r>
-        <w:rPr>
-          <w:rFonts w:ascii="Kalinga" w:hAnsi="Kalinga" w:cs="Kalinga"/>
-          <w:color w:val="auto"/>
-          <w:sz w:val="20"/>
-          <w:szCs w:val="20"/>
-        </w:rPr>
-        <w:t xml:space="preserve">Pencairan dengan Maksimum Kredit sebesar Rp. </w:t>
-      </w:r>
-      <w:r>
-        <w:rPr>
-          <w:rFonts w:hint="default" w:ascii="Kalinga" w:hAnsi="Kalinga"/>
-          <w:color w:val="auto"/>
-          <w:sz w:val="20"/>
-          <w:szCs w:val="20"/>
-          <w:lang w:val="en-US"/>
-        </w:rPr>
-        <w:t xml:space="preserve">{{usulan_plafon}},- </w:t>
-      </w:r>
-      <w:r>
-        <w:rPr>
-          <w:rFonts w:ascii="Kalinga" w:hAnsi="Kalinga" w:cs="Kalinga"/>
-          <w:color w:val="auto"/>
-          <w:sz w:val="20"/>
-          <w:szCs w:val="20"/>
-        </w:rPr>
-        <w:t xml:space="preserve"> akan dilakukan secara sekaligus ke Rekening atas nama Pemoho</w:t>
-      </w:r>
-      <w:r>
-        <w:rPr>
           <w:rFonts w:hint="default" w:ascii="Kalinga" w:hAnsi="Kalinga" w:cs="Kalinga"/>
           <w:color w:val="auto"/>
           <w:sz w:val="20"/>
           <w:szCs w:val="20"/>
           <w:lang w:val="en-US"/>
         </w:rPr>
-        <w:t>n.</w:t>
-      </w:r>
-    </w:p>
-    <w:p>
-      <w:pPr>
-        <w:pStyle w:val="6"/>
-        <w:numPr>
-          <w:ilvl w:val="0"/>
-          <w:numId w:val="1"/>
-        </w:numPr>
-        <w:spacing w:line="240" w:lineRule="auto"/>
-        <w:ind w:left="360" w:leftChars="0" w:right="160" w:rightChars="0" w:hanging="280" w:firstLineChars="0"/>
-        <w:jc w:val="both"/>
-        <w:rPr>
-          <w:rFonts w:ascii="Kalinga" w:hAnsi="Kalinga" w:cs="Kalinga"/>
-          <w:color w:val="auto"/>
-          <w:sz w:val="20"/>
-          <w:szCs w:val="20"/>
-        </w:rPr>
-      </w:pPr>
-      <w:r>
-        <w:rPr>
-          <w:rFonts w:hint="default" w:ascii="Kalinga" w:hAnsi="Kalinga"/>
-          <w:sz w:val="20"/>
-          <w:szCs w:val="20"/>
-          <w:lang w:val="en-US"/>
-        </w:rPr>
-        <w:t>Sisa Pencairan dapat dilakukan setelah Bukti Lunas / Surat Keterangan Lunas Fasilitas Kredit dari Bank  dan Asli SK Pensiun atas nama Pemohon telah diterima Pihak BNI dan Proses Flagging  di BNI atas nama Pemohon telah dijalankan serta setelah semua persyaratan kredit telah terpenuhi.</w:t>
-      </w:r>
-    </w:p>
-    <w:p>
-      <w:pPr>
-        <w:pStyle w:val="6"/>
-        <w:numPr>
-          <w:ilvl w:val="0"/>
-          <w:numId w:val="1"/>
-        </w:numPr>
-        <w:spacing w:line="240" w:lineRule="auto"/>
-        <w:ind w:left="360" w:leftChars="0" w:right="160" w:rightChars="0" w:hanging="280" w:firstLineChars="0"/>
-        <w:jc w:val="both"/>
-        <w:rPr>
-          <w:rFonts w:ascii="Kalinga" w:hAnsi="Kalinga" w:cs="Kalinga"/>
-          <w:color w:val="auto"/>
-          <w:sz w:val="20"/>
-          <w:szCs w:val="20"/>
-        </w:rPr>
-      </w:pPr>
-      <w:r>
-        <w:rPr>
-          <w:rFonts w:ascii="Kalinga" w:hAnsi="Kalinga" w:cs="Kalinga"/>
-          <w:color w:val="auto"/>
-          <w:sz w:val="20"/>
-          <w:szCs w:val="20"/>
-        </w:rPr>
-        <w:t>Lainnya Cfm. ketentuan BNI Fleksi Pensiun dan Ketentuan yang berlaku di BN</w:t>
-      </w:r>
-      <w:bookmarkEnd w:id="16"/>
-      <w:r>
-        <w:rPr>
-          <w:rFonts w:ascii="Kalinga" w:hAnsi="Kalinga" w:cs="Kalinga"/>
-          <w:color w:val="auto"/>
-          <w:sz w:val="20"/>
-          <w:szCs w:val="20"/>
-        </w:rPr>
-        <w:t>I</w:t>
-      </w:r>
-      <w:r>
-        <w:rPr>
-          <w:rFonts w:hint="default" w:ascii="Kalinga" w:hAnsi="Kalinga" w:cs="Kalinga"/>
-          <w:color w:val="auto"/>
-          <w:sz w:val="20"/>
-          <w:szCs w:val="20"/>
-          <w:lang w:val="en-US"/>
-        </w:rPr>
-        <w:t>.</w:t>
+      </w:pPr>
+      <w:r>
+        <w:rPr>
+          <w:rFonts w:hint="default" w:ascii="Kalinga" w:hAnsi="Kalinga"/>
+          <w:color w:val="auto"/>
+          <w:sz w:val="20"/>
+          <w:szCs w:val="20"/>
+          <w:lang w:val="en-US"/>
+        </w:rPr>
+        <w:t>{{text}}{{/list_syarat_pencairan}}</w:t>
       </w:r>
     </w:p>
     <w:sectPr>

</xml_diff>

<commit_message>
feat: update form components, utilities, and documentation
</commit_message>
<xml_diff>
--- a/frontend/templates/template_purna.docx
+++ b/frontend/templates/template_purna.docx
@@ -3899,14 +3899,14 @@
       <w:bookmarkStart w:id="3" w:name="OLE_LINK19"/>
       <w:bookmarkStart w:id="4" w:name="OLE_LINK17"/>
       <w:bookmarkStart w:id="5" w:name="OLE_LINK8"/>
-      <w:bookmarkStart w:id="6" w:name="OLE_LINK32"/>
-      <w:bookmarkStart w:id="7" w:name="OLE_LINK41"/>
+      <w:bookmarkStart w:id="6" w:name="OLE_LINK23"/>
+      <w:bookmarkStart w:id="7" w:name="OLE_LINK24"/>
       <w:bookmarkStart w:id="8" w:name="OLE_LINK10"/>
-      <w:bookmarkStart w:id="9" w:name="OLE_LINK33"/>
-      <w:bookmarkStart w:id="10" w:name="OLE_LINK23"/>
-      <w:bookmarkStart w:id="11" w:name="OLE_LINK3"/>
-      <w:bookmarkStart w:id="12" w:name="OLE_LINK27"/>
-      <w:bookmarkStart w:id="13" w:name="OLE_LINK24"/>
+      <w:bookmarkStart w:id="9" w:name="OLE_LINK32"/>
+      <w:bookmarkStart w:id="10" w:name="OLE_LINK27"/>
+      <w:bookmarkStart w:id="11" w:name="OLE_LINK33"/>
+      <w:bookmarkStart w:id="12" w:name="OLE_LINK3"/>
+      <w:bookmarkStart w:id="13" w:name="OLE_LINK41"/>
       <w:r>
         <w:rPr>
           <w:rFonts w:ascii="Kalinga" w:hAnsi="Kalinga" w:cs="Kalinga"/>
@@ -4135,6 +4135,7 @@
           <w:color w:val="auto"/>
           <w:sz w:val="20"/>
           <w:szCs w:val="20"/>
+          <w:lang w:val="en-US"/>
         </w:rPr>
       </w:pPr>
       <w:r>
@@ -4181,7 +4182,19 @@
           <w:sz w:val="20"/>
           <w:szCs w:val="20"/>
         </w:rPr>
-        <w:t xml:space="preserve">: {{usulan_jangka_waktu}} Bulan </w:t>
+        <w:t>: {{usulan_jangka_waktu}}</w:t>
+      </w:r>
+      <w:r>
+        <w:rPr>
+          <w:rFonts w:hint="default" w:ascii="Kalinga" w:hAnsi="Kalinga"/>
+          <w:b/>
+          <w:bCs/>
+          <w:color w:val="auto"/>
+          <w:sz w:val="20"/>
+          <w:szCs w:val="20"/>
+          <w:lang w:val="en-US"/>
+        </w:rPr>
+        <w:t>.</w:t>
       </w:r>
     </w:p>
     <w:p>
@@ -4242,8 +4255,10 @@
           <w:sz w:val="20"/>
           <w:szCs w:val="20"/>
         </w:rPr>
-        <w:t>: {{bunga_persen}}% p.a Efektif Anuitas</w:t>
-      </w:r>
+        <w:t>: {{bunga_persen}}</w:t>
+      </w:r>
+      <w:bookmarkStart w:id="17" w:name="_GoBack"/>
+      <w:bookmarkEnd w:id="17"/>
     </w:p>
     <w:p>
       <w:pPr>
@@ -4264,6 +4279,7 @@
       <w:pPr>
         <w:pStyle w:val="6"/>
         <w:numPr>
+          <w:ilvl w:val="0"/>
           <w:numId w:val="0"/>
         </w:numPr>
         <w:spacing w:line="240" w:lineRule="auto"/>
@@ -4382,6 +4398,7 @@
       <w:pPr>
         <w:pStyle w:val="6"/>
         <w:numPr>
+          <w:ilvl w:val="0"/>
           <w:numId w:val="0"/>
         </w:numPr>
         <w:spacing w:line="240" w:lineRule="auto"/>
@@ -4395,8 +4412,6 @@
           <w:lang w:val="en-US"/>
         </w:rPr>
       </w:pPr>
-      <w:bookmarkStart w:id="17" w:name="_GoBack"/>
-      <w:bookmarkEnd w:id="17"/>
       <w:r>
         <w:rPr>
           <w:rFonts w:ascii="Kalinga" w:hAnsi="Kalinga" w:cs="Kalinga"/>

</xml_diff>